<commit_message>
Release PrimeNet Publisher v2.3.1
</commit_message>
<xml_diff>
--- a/publication/output/PrimeNet_Architecture_Publication_Draft_v2_3.docx
+++ b/publication/output/PrimeNet_Architecture_Publication_Draft_v2_3.docx
@@ -50,7 +50,7 @@
     </w:p>
     <w:p>
       <w:r>
-        <w:t>The current reference implementation includes a persistent repository covering the interval unavailable, containing unavailable verified prime numbers organized into unavailable independently verified repository segments, with complete repository verification performed after deterministic construction.</w:t>
+        <w:t>The current reference implementation includes a persistent repository covering the interval 1 &lt;= n &lt;= 3,000,000,000,000, containing 108,340,298,703 verified prime numbers organized into 300 independently verified repository segments, with complete repository verification performed after deterministic construction.</w:t>
       </w:r>
     </w:p>
     <w:p>
@@ -150,7 +150,7 @@
                 <w:b w:val="0"/>
                 <w:sz w:val="16"/>
               </w:rPr>
-              <w:t>unavailable</w:t>
+              <w:t>1 &lt;= n &lt;= 3,000,000,000,000</w:t>
             </w:r>
           </w:p>
         </w:tc>
@@ -186,7 +186,7 @@
                 <w:b w:val="0"/>
                 <w:sz w:val="16"/>
               </w:rPr>
-              <w:t>unavailable</w:t>
+              <w:t>108,340,298,703</w:t>
             </w:r>
           </w:p>
         </w:tc>
@@ -222,7 +222,7 @@
                 <w:b w:val="0"/>
                 <w:sz w:val="16"/>
               </w:rPr>
-              <w:t>unavailable</w:t>
+              <w:t>2,999,999,999,933</w:t>
             </w:r>
           </w:p>
         </w:tc>
@@ -258,7 +258,7 @@
                 <w:b w:val="0"/>
                 <w:sz w:val="16"/>
               </w:rPr>
-              <w:t>unavailable</w:t>
+              <w:t>300</w:t>
             </w:r>
           </w:p>
         </w:tc>
@@ -294,7 +294,7 @@
                 <w:b w:val="0"/>
                 <w:sz w:val="16"/>
               </w:rPr>
-              <w:t>unavailable</w:t>
+              <w:t>10,000,000,000 integers</w:t>
             </w:r>
           </w:p>
         </w:tc>
@@ -330,7 +330,7 @@
                 <w:b w:val="0"/>
                 <w:sz w:val="16"/>
               </w:rPr>
-              <w:t>unavailable</w:t>
+              <w:t>300/300 passed; SHA-256 certified</w:t>
             </w:r>
           </w:p>
         </w:tc>
@@ -1000,7 +1000,7 @@
     </w:p>
     <w:p>
       <w:r>
-        <w:t>The reference implementation covers the interval unavailable, contains unavailable verified prime numbers, and is organized into unavailable independently verified repository segments. These values serve as architectural evidence that the repository model has been realized at substantial scale.</w:t>
+        <w:t>The reference implementation covers the interval 1 &lt;= n &lt;= 3,000,000,000,000, contains 108,340,298,703 verified prime numbers, and is organized into 300 independently verified repository segments. These values serve as architectural evidence that the repository model has been realized at substantial scale.</w:t>
       </w:r>
     </w:p>
     <w:p>
@@ -1150,7 +1150,7 @@
                 <w:b w:val="0"/>
                 <w:sz w:val="16"/>
               </w:rPr>
-              <w:t>unavailable</w:t>
+              <w:t>1 &lt;= n &lt;= 3,000,000,000,000</w:t>
             </w:r>
           </w:p>
         </w:tc>
@@ -1186,7 +1186,7 @@
                 <w:b w:val="0"/>
                 <w:sz w:val="16"/>
               </w:rPr>
-              <w:t>unavailable</w:t>
+              <w:t>108,340,298,703</w:t>
             </w:r>
           </w:p>
         </w:tc>
@@ -1222,7 +1222,7 @@
                 <w:b w:val="0"/>
                 <w:sz w:val="16"/>
               </w:rPr>
-              <w:t>unavailable</w:t>
+              <w:t>2,999,999,999,933</w:t>
             </w:r>
           </w:p>
         </w:tc>
@@ -1258,7 +1258,7 @@
                 <w:b w:val="0"/>
                 <w:sz w:val="16"/>
               </w:rPr>
-              <w:t>unavailable</w:t>
+              <w:t>300</w:t>
             </w:r>
           </w:p>
         </w:tc>
@@ -1294,7 +1294,7 @@
                 <w:b w:val="0"/>
                 <w:sz w:val="16"/>
               </w:rPr>
-              <w:t>unavailable</w:t>
+              <w:t>10,000,000,000 integers</w:t>
             </w:r>
           </w:p>
         </w:tc>
@@ -1330,7 +1330,7 @@
                 <w:b w:val="0"/>
                 <w:sz w:val="16"/>
               </w:rPr>
-              <w:t>unavailable</w:t>
+              <w:t>300/300 passed; SHA-256 certified</w:t>
             </w:r>
           </w:p>
         </w:tc>
@@ -2665,7 +2665,7 @@
     </w:p>
     <w:p>
       <w:r>
-        <w:t>The accepted 1–3T twin-prime census provides additional operational evidence. PrimeNet processed {twin_total_gaps} gap records across {twin_partitions} partitions in {twin_end_to_end_runtime_min} minutes end to end. In the conservative steady-state window, the system sustained {steady_gaps_per_sec} gap observations per second with a runtime coefficient of variation of {steady_runtime_cv_percent}.</w:t>
+        <w:t>The accepted 1–3T twin-prime census provides additional operational evidence. PrimeNet processed 108,340,298,703 gap records across 300 partitions in 50.122088 minutes end to end. In the conservative steady-state window, the system sustained 35,859,890.441 gap observations per second with a runtime coefficient of variation of 2.408966%.</w:t>
       </w:r>
     </w:p>
     <w:p>
@@ -2736,6 +2736,559 @@
         <w:t>Table 7. Accepted Twin-Prime Census Performance Measurements.</w:t>
       </w:r>
     </w:p>
+    <w:tbl>
+      <w:tblPr>
+        <w:tblStyle w:val="TableGrid"/>
+        <w:tblW w:type="auto" w:w="0"/>
+        <w:tblLook w:firstColumn="1" w:firstRow="1" w:lastColumn="0" w:lastRow="0" w:noHBand="0" w:noVBand="1" w:val="04A0"/>
+      </w:tblPr>
+      <w:tblGrid>
+        <w:gridCol w:w="5083"/>
+        <w:gridCol w:w="5083"/>
+      </w:tblGrid>
+      <w:tr>
+        <w:tc>
+          <w:tcPr>
+            <w:tcW w:type="dxa" w:w="5083"/>
+            <w:shd w:fill="EAF4FB"/>
+          </w:tcPr>
+          <w:p>
+            <w:pPr>
+              <w:jc w:val="left"/>
+            </w:pPr>
+            <w:r>
+              <w:rPr>
+                <w:b/>
+                <w:sz w:val="16"/>
+              </w:rPr>
+              <w:t>Metric</w:t>
+            </w:r>
+          </w:p>
+        </w:tc>
+        <w:tc>
+          <w:tcPr>
+            <w:tcW w:type="dxa" w:w="5083"/>
+            <w:shd w:fill="EAF4FB"/>
+          </w:tcPr>
+          <w:p>
+            <w:pPr>
+              <w:jc w:val="left"/>
+            </w:pPr>
+            <w:r>
+              <w:rPr>
+                <w:b/>
+                <w:sz w:val="16"/>
+              </w:rPr>
+              <w:t>Accepted Measurement</w:t>
+            </w:r>
+          </w:p>
+        </w:tc>
+      </w:tr>
+      <w:tr>
+        <w:tc>
+          <w:tcPr>
+            <w:tcW w:type="dxa" w:w="5083"/>
+          </w:tcPr>
+          <w:p>
+            <w:pPr>
+              <w:jc w:val="left"/>
+            </w:pPr>
+            <w:r>
+              <w:rPr>
+                <w:b w:val="0"/>
+                <w:sz w:val="16"/>
+              </w:rPr>
+              <w:t>Scientific domain</w:t>
+            </w:r>
+          </w:p>
+        </w:tc>
+        <w:tc>
+          <w:tcPr>
+            <w:tcW w:type="dxa" w:w="5083"/>
+          </w:tcPr>
+          <w:p>
+            <w:pPr>
+              <w:jc w:val="left"/>
+            </w:pPr>
+            <w:r>
+              <w:rPr>
+                <w:b w:val="0"/>
+                <w:sz w:val="16"/>
+              </w:rPr>
+              <w:t>1 – 3,000,000,000,000</w:t>
+            </w:r>
+          </w:p>
+        </w:tc>
+      </w:tr>
+      <w:tr>
+        <w:tc>
+          <w:tcPr>
+            <w:tcW w:type="dxa" w:w="5083"/>
+          </w:tcPr>
+          <w:p>
+            <w:pPr>
+              <w:jc w:val="left"/>
+            </w:pPr>
+            <w:r>
+              <w:rPr>
+                <w:b w:val="0"/>
+                <w:sz w:val="16"/>
+              </w:rPr>
+              <w:t>Repository partitions</w:t>
+            </w:r>
+          </w:p>
+        </w:tc>
+        <w:tc>
+          <w:tcPr>
+            <w:tcW w:type="dxa" w:w="5083"/>
+          </w:tcPr>
+          <w:p>
+            <w:pPr>
+              <w:jc w:val="left"/>
+            </w:pPr>
+            <w:r>
+              <w:rPr>
+                <w:b w:val="0"/>
+                <w:sz w:val="16"/>
+              </w:rPr>
+              <w:t>300</w:t>
+            </w:r>
+          </w:p>
+        </w:tc>
+      </w:tr>
+      <w:tr>
+        <w:tc>
+          <w:tcPr>
+            <w:tcW w:type="dxa" w:w="5083"/>
+          </w:tcPr>
+          <w:p>
+            <w:pPr>
+              <w:jc w:val="left"/>
+            </w:pPr>
+            <w:r>
+              <w:rPr>
+                <w:b w:val="0"/>
+                <w:sz w:val="16"/>
+              </w:rPr>
+              <w:t>Total gaps analyzed</w:t>
+            </w:r>
+          </w:p>
+        </w:tc>
+        <w:tc>
+          <w:tcPr>
+            <w:tcW w:type="dxa" w:w="5083"/>
+          </w:tcPr>
+          <w:p>
+            <w:pPr>
+              <w:jc w:val="left"/>
+            </w:pPr>
+            <w:r>
+              <w:rPr>
+                <w:b w:val="0"/>
+                <w:sz w:val="16"/>
+              </w:rPr>
+              <w:t>108,340,298,703</w:t>
+            </w:r>
+          </w:p>
+        </w:tc>
+      </w:tr>
+      <w:tr>
+        <w:tc>
+          <w:tcPr>
+            <w:tcW w:type="dxa" w:w="5083"/>
+          </w:tcPr>
+          <w:p>
+            <w:pPr>
+              <w:jc w:val="left"/>
+            </w:pPr>
+            <w:r>
+              <w:rPr>
+                <w:b w:val="0"/>
+                <w:sz w:val="16"/>
+              </w:rPr>
+              <w:t>Twin-prime events</w:t>
+            </w:r>
+          </w:p>
+        </w:tc>
+        <w:tc>
+          <w:tcPr>
+            <w:tcW w:type="dxa" w:w="5083"/>
+          </w:tcPr>
+          <w:p>
+            <w:pPr>
+              <w:jc w:val="left"/>
+            </w:pPr>
+            <w:r>
+              <w:rPr>
+                <w:b w:val="0"/>
+                <w:sz w:val="16"/>
+              </w:rPr>
+              <w:t>5,173,760,785</w:t>
+            </w:r>
+          </w:p>
+        </w:tc>
+      </w:tr>
+      <w:tr>
+        <w:tc>
+          <w:tcPr>
+            <w:tcW w:type="dxa" w:w="5083"/>
+          </w:tcPr>
+          <w:p>
+            <w:pPr>
+              <w:jc w:val="left"/>
+            </w:pPr>
+            <w:r>
+              <w:rPr>
+                <w:b w:val="0"/>
+                <w:sz w:val="16"/>
+              </w:rPr>
+              <w:t>Global twin density</w:t>
+            </w:r>
+          </w:p>
+        </w:tc>
+        <w:tc>
+          <w:tcPr>
+            <w:tcW w:type="dxa" w:w="5083"/>
+          </w:tcPr>
+          <w:p>
+            <w:pPr>
+              <w:jc w:val="left"/>
+            </w:pPr>
+            <w:r>
+              <w:rPr>
+                <w:b w:val="0"/>
+                <w:sz w:val="16"/>
+              </w:rPr>
+              <w:t>0.047754721437340</w:t>
+            </w:r>
+          </w:p>
+        </w:tc>
+      </w:tr>
+      <w:tr>
+        <w:tc>
+          <w:tcPr>
+            <w:tcW w:type="dxa" w:w="5083"/>
+          </w:tcPr>
+          <w:p>
+            <w:pPr>
+              <w:jc w:val="left"/>
+            </w:pPr>
+            <w:r>
+              <w:rPr>
+                <w:b w:val="0"/>
+                <w:sz w:val="16"/>
+              </w:rPr>
+              <w:t>End-to-end runtime</w:t>
+            </w:r>
+          </w:p>
+        </w:tc>
+        <w:tc>
+          <w:tcPr>
+            <w:tcW w:type="dxa" w:w="5083"/>
+          </w:tcPr>
+          <w:p>
+            <w:pPr>
+              <w:jc w:val="left"/>
+            </w:pPr>
+            <w:r>
+              <w:rPr>
+                <w:b w:val="0"/>
+                <w:sz w:val="16"/>
+              </w:rPr>
+              <w:t>50.122088 min</w:t>
+            </w:r>
+          </w:p>
+        </w:tc>
+      </w:tr>
+      <w:tr>
+        <w:tc>
+          <w:tcPr>
+            <w:tcW w:type="dxa" w:w="5083"/>
+          </w:tcPr>
+          <w:p>
+            <w:pPr>
+              <w:jc w:val="left"/>
+            </w:pPr>
+            <w:r>
+              <w:rPr>
+                <w:b w:val="0"/>
+                <w:sz w:val="16"/>
+              </w:rPr>
+              <w:t>Runtime accounted for</w:t>
+            </w:r>
+          </w:p>
+        </w:tc>
+        <w:tc>
+          <w:tcPr>
+            <w:tcW w:type="dxa" w:w="5083"/>
+          </w:tcPr>
+          <w:p>
+            <w:pPr>
+              <w:jc w:val="left"/>
+            </w:pPr>
+            <w:r>
+              <w:rPr>
+                <w:b w:val="0"/>
+                <w:sz w:val="16"/>
+              </w:rPr>
+              <w:t>99.995377703%</w:t>
+            </w:r>
+          </w:p>
+        </w:tc>
+      </w:tr>
+      <w:tr>
+        <w:tc>
+          <w:tcPr>
+            <w:tcW w:type="dxa" w:w="5083"/>
+          </w:tcPr>
+          <w:p>
+            <w:pPr>
+              <w:jc w:val="left"/>
+            </w:pPr>
+            <w:r>
+              <w:rPr>
+                <w:b w:val="0"/>
+                <w:sz w:val="16"/>
+              </w:rPr>
+              <w:t>Conservative steady-state partitions</w:t>
+            </w:r>
+          </w:p>
+        </w:tc>
+        <w:tc>
+          <w:tcPr>
+            <w:tcW w:type="dxa" w:w="5083"/>
+          </w:tcPr>
+          <w:p>
+            <w:pPr>
+              <w:jc w:val="left"/>
+            </w:pPr>
+            <w:r>
+              <w:rPr>
+                <w:b w:val="0"/>
+                <w:sz w:val="16"/>
+              </w:rPr>
+              <w:t>290</w:t>
+            </w:r>
+          </w:p>
+        </w:tc>
+      </w:tr>
+      <w:tr>
+        <w:tc>
+          <w:tcPr>
+            <w:tcW w:type="dxa" w:w="5083"/>
+          </w:tcPr>
+          <w:p>
+            <w:pPr>
+              <w:jc w:val="left"/>
+            </w:pPr>
+            <w:r>
+              <w:rPr>
+                <w:b w:val="0"/>
+                <w:sz w:val="16"/>
+              </w:rPr>
+              <w:t>Steady-state gaps analyzed</w:t>
+            </w:r>
+          </w:p>
+        </w:tc>
+        <w:tc>
+          <w:tcPr>
+            <w:tcW w:type="dxa" w:w="5083"/>
+          </w:tcPr>
+          <w:p>
+            <w:pPr>
+              <w:jc w:val="left"/>
+            </w:pPr>
+            <w:r>
+              <w:rPr>
+                <w:b w:val="0"/>
+                <w:sz w:val="16"/>
+              </w:rPr>
+              <w:t>104,222,243,890</w:t>
+            </w:r>
+          </w:p>
+        </w:tc>
+      </w:tr>
+      <w:tr>
+        <w:tc>
+          <w:tcPr>
+            <w:tcW w:type="dxa" w:w="5083"/>
+          </w:tcPr>
+          <w:p>
+            <w:pPr>
+              <w:jc w:val="left"/>
+            </w:pPr>
+            <w:r>
+              <w:rPr>
+                <w:b w:val="0"/>
+                <w:sz w:val="16"/>
+              </w:rPr>
+              <w:t>Mean partition runtime</w:t>
+            </w:r>
+          </w:p>
+        </w:tc>
+        <w:tc>
+          <w:tcPr>
+            <w:tcW w:type="dxa" w:w="5083"/>
+          </w:tcPr>
+          <w:p>
+            <w:pPr>
+              <w:jc w:val="left"/>
+            </w:pPr>
+            <w:r>
+              <w:rPr>
+                <w:b w:val="0"/>
+                <w:sz w:val="16"/>
+              </w:rPr>
+              <w:t>10.021978 sec</w:t>
+            </w:r>
+          </w:p>
+        </w:tc>
+      </w:tr>
+      <w:tr>
+        <w:tc>
+          <w:tcPr>
+            <w:tcW w:type="dxa" w:w="5083"/>
+          </w:tcPr>
+          <w:p>
+            <w:pPr>
+              <w:jc w:val="left"/>
+            </w:pPr>
+            <w:r>
+              <w:rPr>
+                <w:b w:val="0"/>
+                <w:sz w:val="16"/>
+              </w:rPr>
+              <w:t>Median partition runtime</w:t>
+            </w:r>
+          </w:p>
+        </w:tc>
+        <w:tc>
+          <w:tcPr>
+            <w:tcW w:type="dxa" w:w="5083"/>
+          </w:tcPr>
+          <w:p>
+            <w:pPr>
+              <w:jc w:val="left"/>
+            </w:pPr>
+            <w:r>
+              <w:rPr>
+                <w:b w:val="0"/>
+                <w:sz w:val="16"/>
+              </w:rPr>
+              <w:t>10.004263 sec</w:t>
+            </w:r>
+          </w:p>
+        </w:tc>
+      </w:tr>
+      <w:tr>
+        <w:tc>
+          <w:tcPr>
+            <w:tcW w:type="dxa" w:w="5083"/>
+          </w:tcPr>
+          <w:p>
+            <w:pPr>
+              <w:jc w:val="left"/>
+            </w:pPr>
+            <w:r>
+              <w:rPr>
+                <w:b w:val="0"/>
+                <w:sz w:val="16"/>
+              </w:rPr>
+              <w:t>Runtime coefficient of variation</w:t>
+            </w:r>
+          </w:p>
+        </w:tc>
+        <w:tc>
+          <w:tcPr>
+            <w:tcW w:type="dxa" w:w="5083"/>
+          </w:tcPr>
+          <w:p>
+            <w:pPr>
+              <w:jc w:val="left"/>
+            </w:pPr>
+            <w:r>
+              <w:rPr>
+                <w:b w:val="0"/>
+                <w:sz w:val="16"/>
+              </w:rPr>
+              <w:t>2.408966%</w:t>
+            </w:r>
+          </w:p>
+        </w:tc>
+      </w:tr>
+      <w:tr>
+        <w:tc>
+          <w:tcPr>
+            <w:tcW w:type="dxa" w:w="5083"/>
+          </w:tcPr>
+          <w:p>
+            <w:pPr>
+              <w:jc w:val="left"/>
+            </w:pPr>
+            <w:r>
+              <w:rPr>
+                <w:b w:val="0"/>
+                <w:sz w:val="16"/>
+              </w:rPr>
+              <w:t>Runtime P95</w:t>
+            </w:r>
+          </w:p>
+        </w:tc>
+        <w:tc>
+          <w:tcPr>
+            <w:tcW w:type="dxa" w:w="5083"/>
+          </w:tcPr>
+          <w:p>
+            <w:pPr>
+              <w:jc w:val="left"/>
+            </w:pPr>
+            <w:r>
+              <w:rPr>
+                <w:b w:val="0"/>
+                <w:sz w:val="16"/>
+              </w:rPr>
+              <w:t>10.346914 sec</w:t>
+            </w:r>
+          </w:p>
+        </w:tc>
+      </w:tr>
+      <w:tr>
+        <w:tc>
+          <w:tcPr>
+            <w:tcW w:type="dxa" w:w="5083"/>
+          </w:tcPr>
+          <w:p>
+            <w:pPr>
+              <w:jc w:val="left"/>
+            </w:pPr>
+            <w:r>
+              <w:rPr>
+                <w:b w:val="0"/>
+                <w:sz w:val="16"/>
+              </w:rPr>
+              <w:t>Sustained throughput</w:t>
+            </w:r>
+          </w:p>
+        </w:tc>
+        <w:tc>
+          <w:tcPr>
+            <w:tcW w:type="dxa" w:w="5083"/>
+          </w:tcPr>
+          <w:p>
+            <w:pPr>
+              <w:jc w:val="left"/>
+            </w:pPr>
+            <w:r>
+              <w:rPr>
+                <w:b w:val="0"/>
+                <w:sz w:val="16"/>
+              </w:rPr>
+              <w:t>35,859,890.441 gaps/sec</w:t>
+            </w:r>
+          </w:p>
+        </w:tc>
+      </w:tr>
+    </w:tbl>
     <w:p>
       <w:r>
         <w:br w:type="page"/>
@@ -2916,7 +3469,7 @@
     </w:p>
     <w:p>
       <w:r>
-        <w:t>The reference implementation demonstrates the architecture through a repository covering unavailable, containing unavailable verified prime numbers, and passing repository verification across unavailable segments.</w:t>
+        <w:t>The reference implementation demonstrates the architecture through a repository covering 1 &lt;= n &lt;= 3,000,000,000,000, containing 108,340,298,703 verified prime numbers, and passing repository verification across 300 segments.</w:t>
       </w:r>
     </w:p>
     <w:p>
@@ -3027,7 +3580,7 @@
                 <w:b w:val="0"/>
                 <w:sz w:val="16"/>
               </w:rPr>
-              <w:t>unavailable</w:t>
+              <w:t>1 &lt;= n &lt;= 3,000,000,000,000</w:t>
             </w:r>
           </w:p>
         </w:tc>
@@ -3063,7 +3616,7 @@
                 <w:b w:val="0"/>
                 <w:sz w:val="16"/>
               </w:rPr>
-              <w:t>unavailable</w:t>
+              <w:t>108,340,298,703</w:t>
             </w:r>
           </w:p>
         </w:tc>
@@ -3099,7 +3652,7 @@
                 <w:b w:val="0"/>
                 <w:sz w:val="16"/>
               </w:rPr>
-              <w:t>unavailable</w:t>
+              <w:t>2,999,999,999,933</w:t>
             </w:r>
           </w:p>
         </w:tc>
@@ -3135,7 +3688,7 @@
                 <w:b w:val="0"/>
                 <w:sz w:val="16"/>
               </w:rPr>
-              <w:t>unavailable</w:t>
+              <w:t>300</w:t>
             </w:r>
           </w:p>
         </w:tc>
@@ -3171,7 +3724,7 @@
                 <w:b w:val="0"/>
                 <w:sz w:val="16"/>
               </w:rPr>
-              <w:t>unavailable</w:t>
+              <w:t>10,000,000,000 integers</w:t>
             </w:r>
           </w:p>
         </w:tc>
@@ -3207,7 +3760,7 @@
                 <w:b w:val="0"/>
                 <w:sz w:val="16"/>
               </w:rPr>
-              <w:t>unavailable</w:t>
+              <w:t>300/300 passed; SHA-256 certified</w:t>
             </w:r>
           </w:p>
         </w:tc>
@@ -4110,7 +4663,7 @@
                 <w:b w:val="0"/>
                 <w:sz w:val="16"/>
               </w:rPr>
-              <w:t>unavailable</w:t>
+              <w:t>1 &lt;= n &lt;= 3,000,000,000,000</w:t>
             </w:r>
           </w:p>
         </w:tc>
@@ -4146,7 +4699,7 @@
                 <w:b w:val="0"/>
                 <w:sz w:val="16"/>
               </w:rPr>
-              <w:t>unavailable</w:t>
+              <w:t>108,340,298,703</w:t>
             </w:r>
           </w:p>
         </w:tc>
@@ -4182,7 +4735,7 @@
                 <w:b w:val="0"/>
                 <w:sz w:val="16"/>
               </w:rPr>
-              <w:t>unavailable</w:t>
+              <w:t>2,999,999,999,933</w:t>
             </w:r>
           </w:p>
         </w:tc>
@@ -4218,7 +4771,7 @@
                 <w:b w:val="0"/>
                 <w:sz w:val="16"/>
               </w:rPr>
-              <w:t>unavailable</w:t>
+              <w:t>300</w:t>
             </w:r>
           </w:p>
         </w:tc>
@@ -4254,7 +4807,7 @@
                 <w:b w:val="0"/>
                 <w:sz w:val="16"/>
               </w:rPr>
-              <w:t>unavailable</w:t>
+              <w:t>10,000,000,000 integers</w:t>
             </w:r>
           </w:p>
         </w:tc>
@@ -4290,7 +4843,7 @@
                 <w:b w:val="0"/>
                 <w:sz w:val="16"/>
               </w:rPr>
-              <w:t>unavailable</w:t>
+              <w:t>300/300 passed; SHA-256 certified</w:t>
             </w:r>
           </w:p>
         </w:tc>
@@ -4959,6 +5512,571 @@
       </w:tr>
     </w:tbl>
     <w:p/>
+    <w:p>
+      <w:pPr>
+        <w:keepNext/>
+      </w:pPr>
+      <w:r>
+        <w:rPr>
+          <w:b/>
+        </w:rPr>
+        <w:t>Table 7. Accepted Twin-Prime Census Performance Measurements.</w:t>
+      </w:r>
+    </w:p>
+    <w:tbl>
+      <w:tblPr>
+        <w:tblStyle w:val="TableGrid"/>
+        <w:tblW w:type="auto" w:w="0"/>
+        <w:tblLook w:firstColumn="1" w:firstRow="1" w:lastColumn="0" w:lastRow="0" w:noHBand="0" w:noVBand="1" w:val="04A0"/>
+      </w:tblPr>
+      <w:tblGrid>
+        <w:gridCol w:w="5083"/>
+        <w:gridCol w:w="5083"/>
+      </w:tblGrid>
+      <w:tr>
+        <w:tc>
+          <w:tcPr>
+            <w:tcW w:type="dxa" w:w="5083"/>
+            <w:shd w:fill="EAF4FB"/>
+          </w:tcPr>
+          <w:p>
+            <w:pPr>
+              <w:jc w:val="left"/>
+            </w:pPr>
+            <w:r>
+              <w:rPr>
+                <w:b/>
+                <w:sz w:val="16"/>
+              </w:rPr>
+              <w:t>Metric</w:t>
+            </w:r>
+          </w:p>
+        </w:tc>
+        <w:tc>
+          <w:tcPr>
+            <w:tcW w:type="dxa" w:w="5083"/>
+            <w:shd w:fill="EAF4FB"/>
+          </w:tcPr>
+          <w:p>
+            <w:pPr>
+              <w:jc w:val="left"/>
+            </w:pPr>
+            <w:r>
+              <w:rPr>
+                <w:b/>
+                <w:sz w:val="16"/>
+              </w:rPr>
+              <w:t>Accepted Measurement</w:t>
+            </w:r>
+          </w:p>
+        </w:tc>
+      </w:tr>
+      <w:tr>
+        <w:tc>
+          <w:tcPr>
+            <w:tcW w:type="dxa" w:w="5083"/>
+          </w:tcPr>
+          <w:p>
+            <w:pPr>
+              <w:jc w:val="left"/>
+            </w:pPr>
+            <w:r>
+              <w:rPr>
+                <w:b w:val="0"/>
+                <w:sz w:val="16"/>
+              </w:rPr>
+              <w:t>Scientific domain</w:t>
+            </w:r>
+          </w:p>
+        </w:tc>
+        <w:tc>
+          <w:tcPr>
+            <w:tcW w:type="dxa" w:w="5083"/>
+          </w:tcPr>
+          <w:p>
+            <w:pPr>
+              <w:jc w:val="left"/>
+            </w:pPr>
+            <w:r>
+              <w:rPr>
+                <w:b w:val="0"/>
+                <w:sz w:val="16"/>
+              </w:rPr>
+              <w:t>1 – 3,000,000,000,000</w:t>
+            </w:r>
+          </w:p>
+        </w:tc>
+      </w:tr>
+      <w:tr>
+        <w:tc>
+          <w:tcPr>
+            <w:tcW w:type="dxa" w:w="5083"/>
+          </w:tcPr>
+          <w:p>
+            <w:pPr>
+              <w:jc w:val="left"/>
+            </w:pPr>
+            <w:r>
+              <w:rPr>
+                <w:b w:val="0"/>
+                <w:sz w:val="16"/>
+              </w:rPr>
+              <w:t>Repository partitions</w:t>
+            </w:r>
+          </w:p>
+        </w:tc>
+        <w:tc>
+          <w:tcPr>
+            <w:tcW w:type="dxa" w:w="5083"/>
+          </w:tcPr>
+          <w:p>
+            <w:pPr>
+              <w:jc w:val="left"/>
+            </w:pPr>
+            <w:r>
+              <w:rPr>
+                <w:b w:val="0"/>
+                <w:sz w:val="16"/>
+              </w:rPr>
+              <w:t>300</w:t>
+            </w:r>
+          </w:p>
+        </w:tc>
+      </w:tr>
+      <w:tr>
+        <w:tc>
+          <w:tcPr>
+            <w:tcW w:type="dxa" w:w="5083"/>
+          </w:tcPr>
+          <w:p>
+            <w:pPr>
+              <w:jc w:val="left"/>
+            </w:pPr>
+            <w:r>
+              <w:rPr>
+                <w:b w:val="0"/>
+                <w:sz w:val="16"/>
+              </w:rPr>
+              <w:t>Total gaps analyzed</w:t>
+            </w:r>
+          </w:p>
+        </w:tc>
+        <w:tc>
+          <w:tcPr>
+            <w:tcW w:type="dxa" w:w="5083"/>
+          </w:tcPr>
+          <w:p>
+            <w:pPr>
+              <w:jc w:val="left"/>
+            </w:pPr>
+            <w:r>
+              <w:rPr>
+                <w:b w:val="0"/>
+                <w:sz w:val="16"/>
+              </w:rPr>
+              <w:t>108,340,298,703</w:t>
+            </w:r>
+          </w:p>
+        </w:tc>
+      </w:tr>
+      <w:tr>
+        <w:tc>
+          <w:tcPr>
+            <w:tcW w:type="dxa" w:w="5083"/>
+          </w:tcPr>
+          <w:p>
+            <w:pPr>
+              <w:jc w:val="left"/>
+            </w:pPr>
+            <w:r>
+              <w:rPr>
+                <w:b w:val="0"/>
+                <w:sz w:val="16"/>
+              </w:rPr>
+              <w:t>Twin-prime events</w:t>
+            </w:r>
+          </w:p>
+        </w:tc>
+        <w:tc>
+          <w:tcPr>
+            <w:tcW w:type="dxa" w:w="5083"/>
+          </w:tcPr>
+          <w:p>
+            <w:pPr>
+              <w:jc w:val="left"/>
+            </w:pPr>
+            <w:r>
+              <w:rPr>
+                <w:b w:val="0"/>
+                <w:sz w:val="16"/>
+              </w:rPr>
+              <w:t>5,173,760,785</w:t>
+            </w:r>
+          </w:p>
+        </w:tc>
+      </w:tr>
+      <w:tr>
+        <w:tc>
+          <w:tcPr>
+            <w:tcW w:type="dxa" w:w="5083"/>
+          </w:tcPr>
+          <w:p>
+            <w:pPr>
+              <w:jc w:val="left"/>
+            </w:pPr>
+            <w:r>
+              <w:rPr>
+                <w:b w:val="0"/>
+                <w:sz w:val="16"/>
+              </w:rPr>
+              <w:t>Global twin density</w:t>
+            </w:r>
+          </w:p>
+        </w:tc>
+        <w:tc>
+          <w:tcPr>
+            <w:tcW w:type="dxa" w:w="5083"/>
+          </w:tcPr>
+          <w:p>
+            <w:pPr>
+              <w:jc w:val="left"/>
+            </w:pPr>
+            <w:r>
+              <w:rPr>
+                <w:b w:val="0"/>
+                <w:sz w:val="16"/>
+              </w:rPr>
+              <w:t>0.047754721437340</w:t>
+            </w:r>
+          </w:p>
+        </w:tc>
+      </w:tr>
+      <w:tr>
+        <w:tc>
+          <w:tcPr>
+            <w:tcW w:type="dxa" w:w="5083"/>
+          </w:tcPr>
+          <w:p>
+            <w:pPr>
+              <w:jc w:val="left"/>
+            </w:pPr>
+            <w:r>
+              <w:rPr>
+                <w:b w:val="0"/>
+                <w:sz w:val="16"/>
+              </w:rPr>
+              <w:t>End-to-end runtime</w:t>
+            </w:r>
+          </w:p>
+        </w:tc>
+        <w:tc>
+          <w:tcPr>
+            <w:tcW w:type="dxa" w:w="5083"/>
+          </w:tcPr>
+          <w:p>
+            <w:pPr>
+              <w:jc w:val="left"/>
+            </w:pPr>
+            <w:r>
+              <w:rPr>
+                <w:b w:val="0"/>
+                <w:sz w:val="16"/>
+              </w:rPr>
+              <w:t>50.122088 min</w:t>
+            </w:r>
+          </w:p>
+        </w:tc>
+      </w:tr>
+      <w:tr>
+        <w:tc>
+          <w:tcPr>
+            <w:tcW w:type="dxa" w:w="5083"/>
+          </w:tcPr>
+          <w:p>
+            <w:pPr>
+              <w:jc w:val="left"/>
+            </w:pPr>
+            <w:r>
+              <w:rPr>
+                <w:b w:val="0"/>
+                <w:sz w:val="16"/>
+              </w:rPr>
+              <w:t>Runtime accounted for</w:t>
+            </w:r>
+          </w:p>
+        </w:tc>
+        <w:tc>
+          <w:tcPr>
+            <w:tcW w:type="dxa" w:w="5083"/>
+          </w:tcPr>
+          <w:p>
+            <w:pPr>
+              <w:jc w:val="left"/>
+            </w:pPr>
+            <w:r>
+              <w:rPr>
+                <w:b w:val="0"/>
+                <w:sz w:val="16"/>
+              </w:rPr>
+              <w:t>99.995377703%</w:t>
+            </w:r>
+          </w:p>
+        </w:tc>
+      </w:tr>
+      <w:tr>
+        <w:tc>
+          <w:tcPr>
+            <w:tcW w:type="dxa" w:w="5083"/>
+          </w:tcPr>
+          <w:p>
+            <w:pPr>
+              <w:jc w:val="left"/>
+            </w:pPr>
+            <w:r>
+              <w:rPr>
+                <w:b w:val="0"/>
+                <w:sz w:val="16"/>
+              </w:rPr>
+              <w:t>Conservative steady-state partitions</w:t>
+            </w:r>
+          </w:p>
+        </w:tc>
+        <w:tc>
+          <w:tcPr>
+            <w:tcW w:type="dxa" w:w="5083"/>
+          </w:tcPr>
+          <w:p>
+            <w:pPr>
+              <w:jc w:val="left"/>
+            </w:pPr>
+            <w:r>
+              <w:rPr>
+                <w:b w:val="0"/>
+                <w:sz w:val="16"/>
+              </w:rPr>
+              <w:t>290</w:t>
+            </w:r>
+          </w:p>
+        </w:tc>
+      </w:tr>
+      <w:tr>
+        <w:tc>
+          <w:tcPr>
+            <w:tcW w:type="dxa" w:w="5083"/>
+          </w:tcPr>
+          <w:p>
+            <w:pPr>
+              <w:jc w:val="left"/>
+            </w:pPr>
+            <w:r>
+              <w:rPr>
+                <w:b w:val="0"/>
+                <w:sz w:val="16"/>
+              </w:rPr>
+              <w:t>Steady-state gaps analyzed</w:t>
+            </w:r>
+          </w:p>
+        </w:tc>
+        <w:tc>
+          <w:tcPr>
+            <w:tcW w:type="dxa" w:w="5083"/>
+          </w:tcPr>
+          <w:p>
+            <w:pPr>
+              <w:jc w:val="left"/>
+            </w:pPr>
+            <w:r>
+              <w:rPr>
+                <w:b w:val="0"/>
+                <w:sz w:val="16"/>
+              </w:rPr>
+              <w:t>104,222,243,890</w:t>
+            </w:r>
+          </w:p>
+        </w:tc>
+      </w:tr>
+      <w:tr>
+        <w:tc>
+          <w:tcPr>
+            <w:tcW w:type="dxa" w:w="5083"/>
+          </w:tcPr>
+          <w:p>
+            <w:pPr>
+              <w:jc w:val="left"/>
+            </w:pPr>
+            <w:r>
+              <w:rPr>
+                <w:b w:val="0"/>
+                <w:sz w:val="16"/>
+              </w:rPr>
+              <w:t>Mean partition runtime</w:t>
+            </w:r>
+          </w:p>
+        </w:tc>
+        <w:tc>
+          <w:tcPr>
+            <w:tcW w:type="dxa" w:w="5083"/>
+          </w:tcPr>
+          <w:p>
+            <w:pPr>
+              <w:jc w:val="left"/>
+            </w:pPr>
+            <w:r>
+              <w:rPr>
+                <w:b w:val="0"/>
+                <w:sz w:val="16"/>
+              </w:rPr>
+              <w:t>10.021978 sec</w:t>
+            </w:r>
+          </w:p>
+        </w:tc>
+      </w:tr>
+      <w:tr>
+        <w:tc>
+          <w:tcPr>
+            <w:tcW w:type="dxa" w:w="5083"/>
+          </w:tcPr>
+          <w:p>
+            <w:pPr>
+              <w:jc w:val="left"/>
+            </w:pPr>
+            <w:r>
+              <w:rPr>
+                <w:b w:val="0"/>
+                <w:sz w:val="16"/>
+              </w:rPr>
+              <w:t>Median partition runtime</w:t>
+            </w:r>
+          </w:p>
+        </w:tc>
+        <w:tc>
+          <w:tcPr>
+            <w:tcW w:type="dxa" w:w="5083"/>
+          </w:tcPr>
+          <w:p>
+            <w:pPr>
+              <w:jc w:val="left"/>
+            </w:pPr>
+            <w:r>
+              <w:rPr>
+                <w:b w:val="0"/>
+                <w:sz w:val="16"/>
+              </w:rPr>
+              <w:t>10.004263 sec</w:t>
+            </w:r>
+          </w:p>
+        </w:tc>
+      </w:tr>
+      <w:tr>
+        <w:tc>
+          <w:tcPr>
+            <w:tcW w:type="dxa" w:w="5083"/>
+          </w:tcPr>
+          <w:p>
+            <w:pPr>
+              <w:jc w:val="left"/>
+            </w:pPr>
+            <w:r>
+              <w:rPr>
+                <w:b w:val="0"/>
+                <w:sz w:val="16"/>
+              </w:rPr>
+              <w:t>Runtime coefficient of variation</w:t>
+            </w:r>
+          </w:p>
+        </w:tc>
+        <w:tc>
+          <w:tcPr>
+            <w:tcW w:type="dxa" w:w="5083"/>
+          </w:tcPr>
+          <w:p>
+            <w:pPr>
+              <w:jc w:val="left"/>
+            </w:pPr>
+            <w:r>
+              <w:rPr>
+                <w:b w:val="0"/>
+                <w:sz w:val="16"/>
+              </w:rPr>
+              <w:t>2.408966%</w:t>
+            </w:r>
+          </w:p>
+        </w:tc>
+      </w:tr>
+      <w:tr>
+        <w:tc>
+          <w:tcPr>
+            <w:tcW w:type="dxa" w:w="5083"/>
+          </w:tcPr>
+          <w:p>
+            <w:pPr>
+              <w:jc w:val="left"/>
+            </w:pPr>
+            <w:r>
+              <w:rPr>
+                <w:b w:val="0"/>
+                <w:sz w:val="16"/>
+              </w:rPr>
+              <w:t>Runtime P95</w:t>
+            </w:r>
+          </w:p>
+        </w:tc>
+        <w:tc>
+          <w:tcPr>
+            <w:tcW w:type="dxa" w:w="5083"/>
+          </w:tcPr>
+          <w:p>
+            <w:pPr>
+              <w:jc w:val="left"/>
+            </w:pPr>
+            <w:r>
+              <w:rPr>
+                <w:b w:val="0"/>
+                <w:sz w:val="16"/>
+              </w:rPr>
+              <w:t>10.346914 sec</w:t>
+            </w:r>
+          </w:p>
+        </w:tc>
+      </w:tr>
+      <w:tr>
+        <w:tc>
+          <w:tcPr>
+            <w:tcW w:type="dxa" w:w="5083"/>
+          </w:tcPr>
+          <w:p>
+            <w:pPr>
+              <w:jc w:val="left"/>
+            </w:pPr>
+            <w:r>
+              <w:rPr>
+                <w:b w:val="0"/>
+                <w:sz w:val="16"/>
+              </w:rPr>
+              <w:t>Sustained throughput</w:t>
+            </w:r>
+          </w:p>
+        </w:tc>
+        <w:tc>
+          <w:tcPr>
+            <w:tcW w:type="dxa" w:w="5083"/>
+          </w:tcPr>
+          <w:p>
+            <w:pPr>
+              <w:jc w:val="left"/>
+            </w:pPr>
+            <w:r>
+              <w:rPr>
+                <w:b w:val="0"/>
+                <w:sz w:val="16"/>
+              </w:rPr>
+              <w:t>35,859,890.441 gaps/sec</w:t>
+            </w:r>
+          </w:p>
+        </w:tc>
+      </w:tr>
+    </w:tbl>
+    <w:p/>
     <w:sectPr>
       <w:pgSz w:w="12240" w:h="15840"/>
       <w:pgMar w:top="1037" w:right="1037" w:bottom="1037" w:left="1037" w:header="720" w:footer="720" w:gutter="0"/>

</xml_diff>

<commit_message>
PrimeNet v1.0: Architecture release baseline
</commit_message>
<xml_diff>
--- a/publication/output/PrimeNet_Architecture_Publication_Draft_v2_3.docx
+++ b/publication/output/PrimeNet_Architecture_Publication_Draft_v2_3.docx
@@ -1452,7 +1452,7 @@
       <w:r>
         <w:drawing>
           <wp:inline xmlns:a="http://schemas.openxmlformats.org/drawingml/2006/main" xmlns:pic="http://schemas.openxmlformats.org/drawingml/2006/picture">
-            <wp:extent cx="5257800" cy="4028876"/>
+            <wp:extent cx="5257800" cy="3315749"/>
             <wp:docPr id="5" name="Picture 5"/>
             <wp:cNvGraphicFramePr>
               <a:graphicFrameLocks noChangeAspect="1"/>
@@ -1461,7 +1461,7 @@
               <a:graphicData uri="http://schemas.openxmlformats.org/drawingml/2006/picture">
                 <pic:pic>
                   <pic:nvPicPr>
-                    <pic:cNvPr id="0" name="fig06_observatory.png"/>
+                    <pic:cNvPr id="0" name="fig06_repository_scale.png"/>
                     <pic:cNvPicPr/>
                   </pic:nvPicPr>
                   <pic:blipFill>
@@ -1473,7 +1473,7 @@
                   <pic:spPr>
                     <a:xfrm>
                       <a:off x="0" y="0"/>
-                      <a:ext cx="5257800" cy="4028876"/>
+                      <a:ext cx="5257800" cy="3315749"/>
                     </a:xfrm>
                     <a:prstGeom prst="rect"/>
                   </pic:spPr>
@@ -1493,7 +1493,7 @@
           <w:i/>
           <w:sz w:val="17"/>
         </w:rPr>
-        <w:t>Figure 6. PrimeNet Observatory Framework. Observatories operate on the persistent repository, record observation sessions, generate computational products, and organize related products into atlases.</w:t>
+        <w:t>Figure 6. Canonical Repository Scale by Partition. Measured record counts and derived uint64 payload sizes show the physical scale profile across the 300 canonical 10-billion-integer partitions.</w:t>
       </w:r>
     </w:p>
     <w:p>
@@ -1908,7 +1908,7 @@
       <w:r>
         <w:drawing>
           <wp:inline xmlns:a="http://schemas.openxmlformats.org/drawingml/2006/main" xmlns:pic="http://schemas.openxmlformats.org/drawingml/2006/picture">
-            <wp:extent cx="5257800" cy="3419684"/>
+            <wp:extent cx="5257800" cy="3296488"/>
             <wp:docPr id="6" name="Picture 6"/>
             <wp:cNvGraphicFramePr>
               <a:graphicFrameLocks noChangeAspect="1"/>
@@ -1917,7 +1917,7 @@
               <a:graphicData uri="http://schemas.openxmlformats.org/drawingml/2006/picture">
                 <pic:pic>
                   <pic:nvPicPr>
-                    <pic:cNvPr id="0" name="fig07_software.png"/>
+                    <pic:cNvPr id="0" name="fig07_validation.png"/>
                     <pic:cNvPicPr/>
                   </pic:nvPicPr>
                   <pic:blipFill>
@@ -1929,7 +1929,7 @@
                   <pic:spPr>
                     <a:xfrm>
                       <a:off x="0" y="0"/>
-                      <a:ext cx="5257800" cy="3419684"/>
+                      <a:ext cx="5257800" cy="3296488"/>
                     </a:xfrm>
                     <a:prstGeom prst="rect"/>
                   </pic:spPr>
@@ -1949,7 +1949,7 @@
           <w:i/>
           <w:sz w:val="17"/>
         </w:rPr>
-        <w:t>Figure 7. PrimeNet Software Architecture. The implementation separates observatory execution, repository services, metadata services, product services, and persistent repository resources.</w:t>
+        <w:t>Figure 7. Validation Contract Coverage. Independent verification accounts for all prime partitions and every local, cross-partition, and terminal outgoing gap required by the Prime Space ownership contract.</w:t>
       </w:r>
     </w:p>
     <w:p>
@@ -2681,7 +2681,7 @@
       <w:r>
         <w:drawing>
           <wp:inline xmlns:a="http://schemas.openxmlformats.org/drawingml/2006/main" xmlns:pic="http://schemas.openxmlformats.org/drawingml/2006/picture">
-            <wp:extent cx="5257800" cy="3419684"/>
+            <wp:extent cx="5257800" cy="3968299"/>
             <wp:docPr id="7" name="Picture 7"/>
             <wp:cNvGraphicFramePr>
               <a:graphicFrameLocks noChangeAspect="1"/>
@@ -2690,7 +2690,7 @@
               <a:graphicData uri="http://schemas.openxmlformats.org/drawingml/2006/picture">
                 <pic:pic>
                   <pic:nvPicPr>
-                    <pic:cNvPr id="0" name="fig08_validation.png"/>
+                    <pic:cNvPr id="0" name="fig08_performance.png"/>
                     <pic:cNvPicPr/>
                   </pic:nvPicPr>
                   <pic:blipFill>
@@ -2702,7 +2702,7 @@
                   <pic:spPr>
                     <a:xfrm>
                       <a:off x="0" y="0"/>
-                      <a:ext cx="5257800" cy="3419684"/>
+                      <a:ext cx="5257800" cy="3968299"/>
                     </a:xfrm>
                     <a:prstGeom prst="rect"/>
                   </pic:spPr>
@@ -2722,7 +2722,7 @@
           <w:i/>
           <w:sz w:val="17"/>
         </w:rPr>
-        <w:t>Figure 8. Architectural Validation Evidence. Repository scale, segment count, verified prime count, verification status, and largest stored prime provide evidence that the architecture has been realized at trillion scale.</w:t>
+        <w:t>Figure 8. Twin-Prime Census Runtime by Partition. Measured partition runtimes show startup behavior and stable execution across the conservative steady-state window covering partitions 11 through 300.</w:t>
       </w:r>
     </w:p>
     <w:p>
@@ -3325,7 +3325,7 @@
       <w:r>
         <w:drawing>
           <wp:inline xmlns:a="http://schemas.openxmlformats.org/drawingml/2006/main" xmlns:pic="http://schemas.openxmlformats.org/drawingml/2006/picture">
-            <wp:extent cx="5257800" cy="3419684"/>
+            <wp:extent cx="5257800" cy="3664453"/>
             <wp:docPr id="8" name="Picture 8"/>
             <wp:cNvGraphicFramePr>
               <a:graphicFrameLocks noChangeAspect="1"/>
@@ -3346,7 +3346,7 @@
                   <pic:spPr>
                     <a:xfrm>
                       <a:off x="0" y="0"/>
-                      <a:ext cx="5257800" cy="3419684"/>
+                      <a:ext cx="5257800" cy="3664453"/>
                     </a:xfrm>
                     <a:prstGeom prst="rect"/>
                   </pic:spPr>
@@ -3366,7 +3366,7 @@
           <w:i/>
           <w:sz w:val="17"/>
         </w:rPr>
-        <w:t>Figure 9. Incremental Repository Growth. Repository segments may be appended incrementally without reconstructing previously verified computational assets.</w:t>
+        <w:t>Figure 9. Cumulative Repository Growth. Accepted partition counts produce measured cumulative curves for prime records and their uint64 storage payload over the interval from 1 to 3 trillion.</w:t>
       </w:r>
     </w:p>
     <w:p>
@@ -3405,7 +3405,7 @@
       <w:r>
         <w:drawing>
           <wp:inline xmlns:a="http://schemas.openxmlformats.org/drawingml/2006/main" xmlns:pic="http://schemas.openxmlformats.org/drawingml/2006/picture">
-            <wp:extent cx="5257800" cy="3419684"/>
+            <wp:extent cx="5257800" cy="3950540"/>
             <wp:docPr id="9" name="Picture 9"/>
             <wp:cNvGraphicFramePr>
               <a:graphicFrameLocks noChangeAspect="1"/>
@@ -3414,7 +3414,7 @@
               <a:graphicData uri="http://schemas.openxmlformats.org/drawingml/2006/picture">
                 <pic:pic>
                   <pic:nvPicPr>
-                    <pic:cNvPr id="0" name="fig10_ecosystem.png"/>
+                    <pic:cNvPr id="0" name="fig10_observatory.png"/>
                     <pic:cNvPicPr/>
                   </pic:nvPicPr>
                   <pic:blipFill>
@@ -3426,7 +3426,7 @@
                   <pic:spPr>
                     <a:xfrm>
                       <a:off x="0" y="0"/>
-                      <a:ext cx="5257800" cy="3419684"/>
+                      <a:ext cx="5257800" cy="3950540"/>
                     </a:xfrm>
                     <a:prstGeom prst="rect"/>
                   </pic:spPr>
@@ -3446,7 +3446,7 @@
           <w:i/>
           <w:sz w:val="17"/>
         </w:rPr>
-        <w:t>Figure 10. PrimeNet Scientific Ecosystem. Repositories, observatories, products, and atlases form reusable infrastructure supporting future computational investigations.</w:t>
+        <w:t>Figure 10. Twin-Prime Observatory Output. Partition and cumulative event densities visualize the complete finite-domain census of outgoing gaps satisfying g(i)=2.</w:t>
       </w:r>
     </w:p>
     <w:p>

</xml_diff>